<commit_message>
docs: substitui ASCII art por diagrama PNG real
Adiciona script Python que gera o diagrama de arquitetura como PNG
profissional (1700x2000, três camadas coloridas com setas e rótulos)
e atualiza o documento docx para embarcar a imagem no lugar do
ASCII art que não renderizava bem no Word.

Co-Authored-By: Claude Opus 4.7 <noreply@anthropic.com>
</commit_message>
<xml_diff>
--- a/docs/PI3_Entrega_Parcial.docx
+++ b/docs/PI3_Entrega_Parcial.docx
@@ -181,7 +181,7 @@
         </w:rPr>
         <w:t xml:space="preserve">🌐 Acesso à aplicação:  </w:t>
       </w:r>
-      <w:hyperlink w:history="1" r:id="rId7r4mg1pkbceoyc39lzghm">
+      <w:hyperlink w:history="1" r:id="rIdllspmjnvnjmglduz9x6iz">
         <w:r>
           <w:rPr>
             <w:rStyle w:val="Hyperlink"/>
@@ -203,7 +203,7 @@
         </w:rPr>
         <w:t xml:space="preserve">Repositório do código-fonte: </w:t>
       </w:r>
-      <w:hyperlink w:history="1" r:id="rId62dpmktqjryeigj0goiux">
+      <w:hyperlink w:history="1" r:id="rIdjbcgype3zeqr0avugkew1">
         <w:r>
           <w:rPr>
             <w:rStyle w:val="Hyperlink"/>
@@ -485,33 +485,64 @@
     </w:p>
     <w:p>
       <w:pPr>
-        <w:shd w:fill="F5F5F5" w:val="clear"/>
-        <w:spacing w:after="200" w:before="100"/>
+        <w:spacing w:after="100" w:before="100"/>
+        <w:jc w:val="center"/>
+      </w:pPr>
+      <w:r>
+        <w:drawing>
+          <wp:inline distT="0" distB="0" distL="0" distR="0">
+            <wp:extent cx="4381500" cy="5143500"/>
+            <wp:effectExtent t="0" r="0" b="0" l="0"/>
+            <wp:docPr id="1" name="diagrama_arquitetura" descr="Diagrama mostrando as três camadas: Caddy (borda), Flask (aplicação) e Langflow (inteligência)" title="Arquitetura de componentes"/>
+            <wp:cNvGraphicFramePr>
+              <a:graphicFrameLocks xmlns:a="http://schemas.openxmlformats.org/drawingml/2006/main" noChangeAspect="1"/>
+            </wp:cNvGraphicFramePr>
+            <a:graphic xmlns:a="http://schemas.openxmlformats.org/drawingml/2006/main">
+              <a:graphicData uri="http://schemas.openxmlformats.org/drawingml/2006/picture">
+                <pic:pic xmlns:pic="http://schemas.openxmlformats.org/drawingml/2006/picture">
+                  <pic:nvPicPr>
+                    <pic:cNvPr id="0" name="" descr=""/>
+                    <pic:cNvPicPr>
+                      <a:picLocks noChangeAspect="1" noChangeArrowheads="1"/>
+                    </pic:cNvPicPr>
+                  </pic:nvPicPr>
+                  <pic:blipFill>
+                    <a:blip r:embed="rId9" cstate="none"/>
+                    <a:srcRect/>
+                    <a:stretch>
+                      <a:fillRect/>
+                    </a:stretch>
+                  </pic:blipFill>
+                  <pic:spPr bwMode="auto">
+                    <a:xfrm>
+                      <a:off x="0" y="0"/>
+                      <a:ext cx="4381500" cy="5143500"/>
+                    </a:xfrm>
+                    <a:prstGeom prst="rect">
+                      <a:avLst/>
+                    </a:prstGeom>
+                  </pic:spPr>
+                </pic:pic>
+              </a:graphicData>
+            </a:graphic>
+          </wp:inline>
+        </w:drawing>
+      </w:r>
+    </w:p>
+    <w:p>
+      <w:pPr>
+        <w:spacing w:after="200"/>
+        <w:jc w:val="center"/>
       </w:pPr>
       <w:r>
         <w:rPr>
-          <w:rFonts w:ascii="Consolas" w:cs="Consolas" w:eastAsia="Consolas" w:hAnsi="Consolas"/>
+          <w:i/>
+          <w:iCs/>
+          <w:color w:val="6B6B75"/>
           <w:sz w:val="18"/>
           <w:szCs w:val="18"/>
         </w:rPr>
-        <w:t xml:space="preserve">Internet (HTTPS)
-      ↓
-┌──────────────────────────────────────┐
-│  Caddy (porta 443/80)                │  ← Proxy reverso + TLS
-│  + Let's Encrypt auto-renovável      │
-└──────────────────────────────────────┘
-      ↓ (rede interna)
-┌──────────────────────────────────────┐
-│  Flask + Gunicorn (porta 5000)       │  ← Aplicação web
-│  • Serve UI estática                 │
-│  • Endpoints /chat /register /rates  │
-└──────────────────────────────────────┘
-      ↓ (rede interna)
-┌──────────────────────────────────────┐
-│  Langflow (porta 7860)               │  ← Motor de IA
-│  • Agent Claude Haiku 4.5            │
-│  • Memória por sessão isolada        │
-└──────────────────────────────────────┘</w:t>
+        <w:t xml:space="preserve">Figura 1 — Arquitetura de componentes em três camadas (borda, aplicação, inteligência).</w:t>
       </w:r>
     </w:p>
     <w:p>
@@ -2630,7 +2661,7 @@
         </w:rPr>
         <w:t xml:space="preserve">• Aplicação principal:  </w:t>
       </w:r>
-      <w:hyperlink w:history="1" r:id="rId8dkbp4h-cogj1wju_hbtq">
+      <w:hyperlink w:history="1" r:id="rIdegux7jyqz4uhkqdycp6wy">
         <w:r>
           <w:rPr>
             <w:rStyle w:val="Hyperlink"/>
@@ -2652,7 +2683,7 @@
         </w:rPr>
         <w:t xml:space="preserve">• Painel administrativo do Langflow:  </w:t>
       </w:r>
-      <w:hyperlink w:history="1" r:id="rIdvxnywr6mshvqzzemxwg5v">
+      <w:hyperlink w:history="1" r:id="rIdzgnvct_a-8qd0jo5_wfgk">
         <w:r>
           <w:rPr>
             <w:rStyle w:val="Hyperlink"/>
@@ -2674,7 +2705,7 @@
         </w:rPr>
         <w:t xml:space="preserve">• Repositório do código-fonte:  </w:t>
       </w:r>
-      <w:hyperlink w:history="1" r:id="rIdxl1jzhq0k1vrspib-7crb">
+      <w:hyperlink w:history="1" r:id="rIdyacizvwljdnljoxc4unky">
         <w:r>
           <w:rPr>
             <w:rStyle w:val="Hyperlink"/>

</xml_diff>